<commit_message>
Update New student-staff walkthrough.docx
</commit_message>
<xml_diff>
--- a/Onboarding/New student-staff walkthrough.docx
+++ b/Onboarding/New student-staff walkthrough.docx
@@ -1,6 +1,6 @@
 
 <file path=word/document.xml><?xml version="1.0" encoding="utf-8"?>
-<w:document xmlns:wpc="http://schemas.microsoft.com/office/word/2010/wordprocessingCanvas" xmlns:cx="http://schemas.microsoft.com/office/drawing/2014/chartex" xmlns:cx1="http://schemas.microsoft.com/office/drawing/2015/9/8/chartex" xmlns:cx2="http://schemas.microsoft.com/office/drawing/2015/10/21/chartex" xmlns:cx3="http://schemas.microsoft.com/office/drawing/2016/5/9/chartex" xmlns:cx4="http://schemas.microsoft.com/office/drawing/2016/5/10/chartex" xmlns:cx5="http://schemas.microsoft.com/office/drawing/2016/5/11/chartex" xmlns:cx6="http://schemas.microsoft.com/office/drawing/2016/5/12/chartex" xmlns:cx7="http://schemas.microsoft.com/office/drawing/2016/5/13/chartex" xmlns:cx8="http://schemas.microsoft.com/office/drawing/2016/5/14/chartex" xmlns:mc="http://schemas.openxmlformats.org/markup-compatibility/2006" xmlns:aink="http://schemas.microsoft.com/office/drawing/2016/ink" xmlns:am3d="http://schemas.microsoft.com/office/drawing/2017/model3d" xmlns:o="urn:schemas-microsoft-com:office:office" xmlns:r="http://schemas.openxmlformats.org/officeDocument/2006/relationships" xmlns:m="http://schemas.openxmlformats.org/officeDocument/2006/math" xmlns:v="urn:schemas-microsoft-com:vml" xmlns:wp14="http://schemas.microsoft.com/office/word/2010/wordprocessingDrawing" xmlns:wp="http://schemas.openxmlformats.org/drawingml/2006/wordprocessingDrawing" xmlns:w10="urn:schemas-microsoft-com:office:word" xmlns:w="http://schemas.openxmlformats.org/wordprocessingml/2006/main" xmlns:w14="http://schemas.microsoft.com/office/word/2010/wordml" xmlns:w15="http://schemas.microsoft.com/office/word/2012/wordml" xmlns:w16cid="http://schemas.microsoft.com/office/word/2016/wordml/cid" xmlns:w16se="http://schemas.microsoft.com/office/word/2015/wordml/symex" xmlns:wpg="http://schemas.microsoft.com/office/word/2010/wordprocessingGroup" xmlns:wpi="http://schemas.microsoft.com/office/word/2010/wordprocessingInk" xmlns:wne="http://schemas.microsoft.com/office/word/2006/wordml" xmlns:wps="http://schemas.microsoft.com/office/word/2010/wordprocessingShape" mc:Ignorable="w14 w15 w16se w16cid wp14">
+<w:document xmlns:wpc="http://schemas.microsoft.com/office/word/2010/wordprocessingCanvas" xmlns:cx="http://schemas.microsoft.com/office/drawing/2014/chartex" xmlns:cx1="http://schemas.microsoft.com/office/drawing/2015/9/8/chartex" xmlns:cx2="http://schemas.microsoft.com/office/drawing/2015/10/21/chartex" xmlns:cx3="http://schemas.microsoft.com/office/drawing/2016/5/9/chartex" xmlns:cx4="http://schemas.microsoft.com/office/drawing/2016/5/10/chartex" xmlns:cx5="http://schemas.microsoft.com/office/drawing/2016/5/11/chartex" xmlns:cx6="http://schemas.microsoft.com/office/drawing/2016/5/12/chartex" xmlns:cx7="http://schemas.microsoft.com/office/drawing/2016/5/13/chartex" xmlns:cx8="http://schemas.microsoft.com/office/drawing/2016/5/14/chartex" xmlns:mc="http://schemas.openxmlformats.org/markup-compatibility/2006" xmlns:aink="http://schemas.microsoft.com/office/drawing/2016/ink" xmlns:am3d="http://schemas.microsoft.com/office/drawing/2017/model3d" xmlns:o="urn:schemas-microsoft-com:office:office" xmlns:r="http://schemas.openxmlformats.org/officeDocument/2006/relationships" xmlns:m="http://schemas.openxmlformats.org/officeDocument/2006/math" xmlns:v="urn:schemas-microsoft-com:vml" xmlns:wp14="http://schemas.microsoft.com/office/word/2010/wordprocessingDrawing" xmlns:wp="http://schemas.openxmlformats.org/drawingml/2006/wordprocessingDrawing" xmlns:w10="urn:schemas-microsoft-com:office:word" xmlns:w="http://schemas.openxmlformats.org/wordprocessingml/2006/main" xmlns:w14="http://schemas.microsoft.com/office/word/2010/wordml" xmlns:w15="http://schemas.microsoft.com/office/word/2012/wordml" xmlns:w16cex="http://schemas.microsoft.com/office/word/2018/wordml/cex" xmlns:w16cid="http://schemas.microsoft.com/office/word/2016/wordml/cid" xmlns:w16="http://schemas.microsoft.com/office/word/2018/wordml" xmlns:w16sdtdh="http://schemas.microsoft.com/office/word/2020/wordml/sdtdatahash" xmlns:w16se="http://schemas.microsoft.com/office/word/2015/wordml/symex" xmlns:wpg="http://schemas.microsoft.com/office/word/2010/wordprocessingGroup" xmlns:wpi="http://schemas.microsoft.com/office/word/2010/wordprocessingInk" xmlns:wne="http://schemas.microsoft.com/office/word/2006/wordml" xmlns:wps="http://schemas.microsoft.com/office/word/2010/wordprocessingShape" mc:Ignorable="w14 w15 w16se w16cid w16 w16cex w16sdtdh wp14">
   <w:body>
     <w:p>
       <w:pPr>
@@ -45,7 +45,7 @@
         <w:pStyle w:val="ListParagraph"/>
         <w:numPr>
           <w:ilvl w:val="0"/>
-          <w:numId w:val="1"/>
+          <w:numId w:val="2"/>
         </w:numPr>
         <w:rPr>
           <w:lang w:val="en-CA"/>
@@ -62,8 +62,8 @@
       <w:pPr>
         <w:pStyle w:val="ListParagraph"/>
         <w:numPr>
-          <w:ilvl w:val="1"/>
-          <w:numId w:val="1"/>
+          <w:ilvl w:val="0"/>
+          <w:numId w:val="3"/>
         </w:numPr>
         <w:rPr>
           <w:lang w:val="en-CA"/>
@@ -81,7 +81,7 @@
         <w:pStyle w:val="ListParagraph"/>
         <w:numPr>
           <w:ilvl w:val="0"/>
-          <w:numId w:val="1"/>
+          <w:numId w:val="2"/>
         </w:numPr>
         <w:rPr>
           <w:lang w:val="en-CA"/>
@@ -98,8 +98,8 @@
       <w:pPr>
         <w:pStyle w:val="ListParagraph"/>
         <w:numPr>
-          <w:ilvl w:val="1"/>
-          <w:numId w:val="1"/>
+          <w:ilvl w:val="0"/>
+          <w:numId w:val="3"/>
         </w:numPr>
         <w:rPr>
           <w:lang w:val="en-CA"/>
@@ -116,8 +116,8 @@
       <w:pPr>
         <w:pStyle w:val="ListParagraph"/>
         <w:numPr>
-          <w:ilvl w:val="1"/>
-          <w:numId w:val="1"/>
+          <w:ilvl w:val="0"/>
+          <w:numId w:val="3"/>
         </w:numPr>
         <w:rPr>
           <w:lang w:val="en-CA"/>
@@ -135,7 +135,7 @@
         <w:pStyle w:val="ListParagraph"/>
         <w:numPr>
           <w:ilvl w:val="0"/>
-          <w:numId w:val="1"/>
+          <w:numId w:val="2"/>
         </w:numPr>
         <w:rPr>
           <w:lang w:val="en-CA"/>
@@ -158,8 +158,8 @@
       <w:pPr>
         <w:pStyle w:val="ListParagraph"/>
         <w:numPr>
-          <w:ilvl w:val="1"/>
-          <w:numId w:val="1"/>
+          <w:ilvl w:val="0"/>
+          <w:numId w:val="3"/>
         </w:numPr>
         <w:rPr>
           <w:lang w:val="en-CA"/>
@@ -176,8 +176,8 @@
       <w:pPr>
         <w:pStyle w:val="ListParagraph"/>
         <w:numPr>
-          <w:ilvl w:val="1"/>
-          <w:numId w:val="1"/>
+          <w:ilvl w:val="0"/>
+          <w:numId w:val="3"/>
         </w:numPr>
         <w:rPr>
           <w:lang w:val="en-CA"/>
@@ -195,7 +195,7 @@
         <w:pStyle w:val="ListParagraph"/>
         <w:numPr>
           <w:ilvl w:val="0"/>
-          <w:numId w:val="1"/>
+          <w:numId w:val="2"/>
         </w:numPr>
         <w:rPr>
           <w:lang w:val="en-CA"/>
@@ -212,8 +212,8 @@
       <w:pPr>
         <w:pStyle w:val="ListParagraph"/>
         <w:numPr>
-          <w:ilvl w:val="1"/>
-          <w:numId w:val="1"/>
+          <w:ilvl w:val="0"/>
+          <w:numId w:val="3"/>
         </w:numPr>
         <w:rPr>
           <w:lang w:val="en-CA"/>
@@ -230,8 +230,8 @@
       <w:pPr>
         <w:pStyle w:val="ListParagraph"/>
         <w:numPr>
-          <w:ilvl w:val="1"/>
-          <w:numId w:val="1"/>
+          <w:ilvl w:val="0"/>
+          <w:numId w:val="3"/>
         </w:numPr>
         <w:rPr>
           <w:lang w:val="en-CA"/>
@@ -249,7 +249,7 @@
         <w:pStyle w:val="ListParagraph"/>
         <w:numPr>
           <w:ilvl w:val="0"/>
-          <w:numId w:val="1"/>
+          <w:numId w:val="2"/>
         </w:numPr>
         <w:rPr>
           <w:lang w:val="en-CA"/>
@@ -266,8 +266,8 @@
       <w:pPr>
         <w:pStyle w:val="ListParagraph"/>
         <w:numPr>
-          <w:ilvl w:val="1"/>
-          <w:numId w:val="1"/>
+          <w:ilvl w:val="0"/>
+          <w:numId w:val="3"/>
         </w:numPr>
         <w:rPr>
           <w:lang w:val="en-CA"/>
@@ -284,8 +284,8 @@
       <w:pPr>
         <w:pStyle w:val="ListParagraph"/>
         <w:numPr>
-          <w:ilvl w:val="1"/>
-          <w:numId w:val="1"/>
+          <w:ilvl w:val="0"/>
+          <w:numId w:val="3"/>
         </w:numPr>
         <w:rPr>
           <w:lang w:val="en-CA"/>
@@ -297,15 +297,13 @@
         </w:rPr>
         <w:t>Staff 604-822-4444 or 911</w:t>
       </w:r>
-      <w:bookmarkStart w:id="0" w:name="_GoBack"/>
-      <w:bookmarkEnd w:id="0"/>
-    </w:p>
-    <w:p>
-      <w:pPr>
-        <w:pStyle w:val="ListParagraph"/>
-        <w:numPr>
-          <w:ilvl w:val="1"/>
-          <w:numId w:val="1"/>
+    </w:p>
+    <w:p>
+      <w:pPr>
+        <w:pStyle w:val="ListParagraph"/>
+        <w:numPr>
+          <w:ilvl w:val="0"/>
+          <w:numId w:val="3"/>
         </w:numPr>
         <w:rPr>
           <w:lang w:val="en-CA"/>
@@ -323,7 +321,7 @@
         <w:pStyle w:val="ListParagraph"/>
         <w:numPr>
           <w:ilvl w:val="0"/>
-          <w:numId w:val="1"/>
+          <w:numId w:val="2"/>
         </w:numPr>
         <w:rPr>
           <w:lang w:val="en-CA"/>
@@ -340,8 +338,8 @@
       <w:pPr>
         <w:pStyle w:val="ListParagraph"/>
         <w:numPr>
-          <w:ilvl w:val="1"/>
-          <w:numId w:val="1"/>
+          <w:ilvl w:val="0"/>
+          <w:numId w:val="3"/>
         </w:numPr>
         <w:rPr>
           <w:lang w:val="en-CA"/>
@@ -358,8 +356,8 @@
       <w:pPr>
         <w:pStyle w:val="ListParagraph"/>
         <w:numPr>
-          <w:ilvl w:val="1"/>
-          <w:numId w:val="1"/>
+          <w:ilvl w:val="0"/>
+          <w:numId w:val="3"/>
         </w:numPr>
         <w:rPr>
           <w:lang w:val="en-CA"/>
@@ -377,7 +375,7 @@
         <w:pStyle w:val="ListParagraph"/>
         <w:numPr>
           <w:ilvl w:val="0"/>
-          <w:numId w:val="1"/>
+          <w:numId w:val="2"/>
         </w:numPr>
         <w:rPr>
           <w:lang w:val="en-CA"/>
@@ -395,7 +393,7 @@
         <w:pStyle w:val="ListParagraph"/>
         <w:numPr>
           <w:ilvl w:val="0"/>
-          <w:numId w:val="1"/>
+          <w:numId w:val="2"/>
         </w:numPr>
         <w:rPr>
           <w:lang w:val="en-CA"/>
@@ -413,7 +411,7 @@
         <w:pStyle w:val="ListParagraph"/>
         <w:numPr>
           <w:ilvl w:val="0"/>
-          <w:numId w:val="1"/>
+          <w:numId w:val="2"/>
         </w:numPr>
         <w:rPr>
           <w:lang w:val="en-CA"/>
@@ -431,7 +429,7 @@
         <w:pStyle w:val="ListParagraph"/>
         <w:numPr>
           <w:ilvl w:val="0"/>
-          <w:numId w:val="1"/>
+          <w:numId w:val="2"/>
         </w:numPr>
         <w:rPr>
           <w:lang w:val="en-CA"/>
@@ -449,7 +447,7 @@
         <w:pStyle w:val="ListParagraph"/>
         <w:numPr>
           <w:ilvl w:val="0"/>
-          <w:numId w:val="1"/>
+          <w:numId w:val="2"/>
         </w:numPr>
         <w:rPr>
           <w:lang w:val="en-CA"/>
@@ -467,7 +465,7 @@
         <w:pStyle w:val="ListParagraph"/>
         <w:numPr>
           <w:ilvl w:val="0"/>
-          <w:numId w:val="1"/>
+          <w:numId w:val="2"/>
         </w:numPr>
         <w:rPr>
           <w:lang w:val="en-CA"/>
@@ -484,50 +482,38 @@
       <w:pPr>
         <w:pStyle w:val="ListParagraph"/>
         <w:numPr>
-          <w:ilvl w:val="1"/>
-          <w:numId w:val="1"/>
-        </w:numPr>
-        <w:rPr>
-          <w:lang w:val="en-CA"/>
-        </w:rPr>
-      </w:pPr>
-      <w:r>
-        <w:rPr>
-          <w:lang w:val="en-CA"/>
-        </w:rPr>
-        <w:t>Lab phone</w:t>
-      </w:r>
-      <w:r>
-        <w:rPr>
-          <w:lang w:val="en-CA"/>
-        </w:rPr>
-        <w:t xml:space="preserve"> 604-827-2498</w:t>
-      </w:r>
-    </w:p>
-    <w:p>
-      <w:pPr>
-        <w:pStyle w:val="ListParagraph"/>
-        <w:numPr>
-          <w:ilvl w:val="1"/>
-          <w:numId w:val="1"/>
-        </w:numPr>
-        <w:rPr>
-          <w:lang w:val="en-CA"/>
-        </w:rPr>
-      </w:pPr>
-      <w:r>
-        <w:rPr>
-          <w:lang w:val="en-CA"/>
-        </w:rPr>
-        <w:t>Rick’s phone 604-822-3500 forwarded to cell</w:t>
-      </w:r>
-    </w:p>
-    <w:p>
-      <w:pPr>
-        <w:pStyle w:val="ListParagraph"/>
-        <w:numPr>
-          <w:ilvl w:val="0"/>
-          <w:numId w:val="1"/>
+          <w:ilvl w:val="0"/>
+          <w:numId w:val="3"/>
+        </w:numPr>
+        <w:rPr>
+          <w:lang w:val="en-CA"/>
+        </w:rPr>
+      </w:pPr>
+      <w:r>
+        <w:rPr>
+          <w:lang w:val="en-CA"/>
+        </w:rPr>
+        <w:t>Devin</w:t>
+      </w:r>
+      <w:r>
+        <w:rPr>
+          <w:lang w:val="en-CA"/>
+        </w:rPr>
+        <w:t xml:space="preserve">’s phone </w:t>
+      </w:r>
+      <w:r>
+        <w:rPr>
+          <w:lang w:val="en-CA"/>
+        </w:rPr>
+        <w:t>778-678-7376</w:t>
+      </w:r>
+    </w:p>
+    <w:p>
+      <w:pPr>
+        <w:pStyle w:val="ListParagraph"/>
+        <w:numPr>
+          <w:ilvl w:val="0"/>
+          <w:numId w:val="2"/>
         </w:numPr>
         <w:rPr>
           <w:lang w:val="en-CA"/>
@@ -545,7 +531,7 @@
         <w:pStyle w:val="ListParagraph"/>
         <w:numPr>
           <w:ilvl w:val="0"/>
-          <w:numId w:val="1"/>
+          <w:numId w:val="2"/>
         </w:numPr>
         <w:rPr>
           <w:lang w:val="en-CA"/>
@@ -563,7 +549,7 @@
         <w:pStyle w:val="ListParagraph"/>
         <w:numPr>
           <w:ilvl w:val="0"/>
-          <w:numId w:val="1"/>
+          <w:numId w:val="2"/>
         </w:numPr>
         <w:rPr>
           <w:lang w:val="en-CA"/>
@@ -580,8 +566,8 @@
       <w:pPr>
         <w:pStyle w:val="ListParagraph"/>
         <w:numPr>
-          <w:ilvl w:val="1"/>
-          <w:numId w:val="1"/>
+          <w:ilvl w:val="0"/>
+          <w:numId w:val="3"/>
         </w:numPr>
         <w:rPr>
           <w:lang w:val="en-CA"/>
@@ -598,8 +584,8 @@
       <w:pPr>
         <w:pStyle w:val="ListParagraph"/>
         <w:numPr>
-          <w:ilvl w:val="1"/>
-          <w:numId w:val="1"/>
+          <w:ilvl w:val="0"/>
+          <w:numId w:val="3"/>
         </w:numPr>
         <w:rPr>
           <w:lang w:val="en-CA"/>
@@ -652,7 +638,7 @@
 </file>
 
 <file path=word/numbering.xml><?xml version="1.0" encoding="utf-8"?>
-<w:numbering xmlns:wpc="http://schemas.microsoft.com/office/word/2010/wordprocessingCanvas" xmlns:cx="http://schemas.microsoft.com/office/drawing/2014/chartex" xmlns:cx1="http://schemas.microsoft.com/office/drawing/2015/9/8/chartex" xmlns:cx2="http://schemas.microsoft.com/office/drawing/2015/10/21/chartex" xmlns:cx3="http://schemas.microsoft.com/office/drawing/2016/5/9/chartex" xmlns:cx4="http://schemas.microsoft.com/office/drawing/2016/5/10/chartex" xmlns:cx5="http://schemas.microsoft.com/office/drawing/2016/5/11/chartex" xmlns:cx6="http://schemas.microsoft.com/office/drawing/2016/5/12/chartex" xmlns:cx7="http://schemas.microsoft.com/office/drawing/2016/5/13/chartex" xmlns:cx8="http://schemas.microsoft.com/office/drawing/2016/5/14/chartex" xmlns:mc="http://schemas.openxmlformats.org/markup-compatibility/2006" xmlns:aink="http://schemas.microsoft.com/office/drawing/2016/ink" xmlns:am3d="http://schemas.microsoft.com/office/drawing/2017/model3d" xmlns:o="urn:schemas-microsoft-com:office:office" xmlns:r="http://schemas.openxmlformats.org/officeDocument/2006/relationships" xmlns:m="http://schemas.openxmlformats.org/officeDocument/2006/math" xmlns:v="urn:schemas-microsoft-com:vml" xmlns:wp14="http://schemas.microsoft.com/office/word/2010/wordprocessingDrawing" xmlns:wp="http://schemas.openxmlformats.org/drawingml/2006/wordprocessingDrawing" xmlns:w10="urn:schemas-microsoft-com:office:word" xmlns:w="http://schemas.openxmlformats.org/wordprocessingml/2006/main" xmlns:w14="http://schemas.microsoft.com/office/word/2010/wordml" xmlns:w15="http://schemas.microsoft.com/office/word/2012/wordml" xmlns:w16cid="http://schemas.microsoft.com/office/word/2016/wordml/cid" xmlns:w16se="http://schemas.microsoft.com/office/word/2015/wordml/symex" xmlns:wpg="http://schemas.microsoft.com/office/word/2010/wordprocessingGroup" xmlns:wpi="http://schemas.microsoft.com/office/word/2010/wordprocessingInk" xmlns:wne="http://schemas.microsoft.com/office/word/2006/wordml" xmlns:wps="http://schemas.microsoft.com/office/word/2010/wordprocessingShape" mc:Ignorable="w14 w15 w16se w16cid wp14">
+<w:numbering xmlns:wpc="http://schemas.microsoft.com/office/word/2010/wordprocessingCanvas" xmlns:cx="http://schemas.microsoft.com/office/drawing/2014/chartex" xmlns:cx1="http://schemas.microsoft.com/office/drawing/2015/9/8/chartex" xmlns:cx2="http://schemas.microsoft.com/office/drawing/2015/10/21/chartex" xmlns:cx3="http://schemas.microsoft.com/office/drawing/2016/5/9/chartex" xmlns:cx4="http://schemas.microsoft.com/office/drawing/2016/5/10/chartex" xmlns:cx5="http://schemas.microsoft.com/office/drawing/2016/5/11/chartex" xmlns:cx6="http://schemas.microsoft.com/office/drawing/2016/5/12/chartex" xmlns:cx7="http://schemas.microsoft.com/office/drawing/2016/5/13/chartex" xmlns:cx8="http://schemas.microsoft.com/office/drawing/2016/5/14/chartex" xmlns:mc="http://schemas.openxmlformats.org/markup-compatibility/2006" xmlns:aink="http://schemas.microsoft.com/office/drawing/2016/ink" xmlns:am3d="http://schemas.microsoft.com/office/drawing/2017/model3d" xmlns:o="urn:schemas-microsoft-com:office:office" xmlns:r="http://schemas.openxmlformats.org/officeDocument/2006/relationships" xmlns:m="http://schemas.openxmlformats.org/officeDocument/2006/math" xmlns:v="urn:schemas-microsoft-com:vml" xmlns:wp14="http://schemas.microsoft.com/office/word/2010/wordprocessingDrawing" xmlns:wp="http://schemas.openxmlformats.org/drawingml/2006/wordprocessingDrawing" xmlns:w10="urn:schemas-microsoft-com:office:word" xmlns:w="http://schemas.openxmlformats.org/wordprocessingml/2006/main" xmlns:w14="http://schemas.microsoft.com/office/word/2010/wordml" xmlns:w15="http://schemas.microsoft.com/office/word/2012/wordml" xmlns:w16cex="http://schemas.microsoft.com/office/word/2018/wordml/cex" xmlns:w16cid="http://schemas.microsoft.com/office/word/2016/wordml/cid" xmlns:w16="http://schemas.microsoft.com/office/word/2018/wordml" xmlns:w16sdtdh="http://schemas.microsoft.com/office/word/2020/wordml/sdtdatahash" xmlns:w16se="http://schemas.microsoft.com/office/word/2015/wordml/symex" xmlns:wpg="http://schemas.microsoft.com/office/word/2010/wordprocessingGroup" xmlns:wpi="http://schemas.microsoft.com/office/word/2010/wordprocessingInk" xmlns:wne="http://schemas.microsoft.com/office/word/2006/wordml" xmlns:wps="http://schemas.microsoft.com/office/word/2010/wordprocessingShape" mc:Ignorable="w14 w15 w16se w16cid w16 w16cex w16sdtdh wp14">
   <w:abstractNum w:abstractNumId="0" w15:restartNumberingAfterBreak="0">
     <w:nsid w:val="149F475C"/>
     <w:multiLevelType w:val="hybridMultilevel"/>
@@ -766,14 +752,245 @@
       </w:rPr>
     </w:lvl>
   </w:abstractNum>
+  <w:abstractNum w:abstractNumId="1" w15:restartNumberingAfterBreak="0">
+    <w:nsid w:val="44761B59"/>
+    <w:multiLevelType w:val="hybridMultilevel"/>
+    <w:tmpl w:val="021E8B30"/>
+    <w:lvl w:ilvl="0" w:tplc="87740A78">
+      <w:numFmt w:val="bullet"/>
+      <w:lvlText w:val="-"/>
+      <w:lvlJc w:val="left"/>
+      <w:pPr>
+        <w:ind w:left="1800" w:hanging="360"/>
+      </w:pPr>
+      <w:rPr>
+        <w:rFonts w:ascii="Calibri" w:eastAsiaTheme="minorHAnsi" w:hAnsi="Calibri" w:cs="Calibri" w:hint="default"/>
+      </w:rPr>
+    </w:lvl>
+    <w:lvl w:ilvl="1" w:tplc="10090003" w:tentative="1">
+      <w:start w:val="1"/>
+      <w:numFmt w:val="bullet"/>
+      <w:lvlText w:val="o"/>
+      <w:lvlJc w:val="left"/>
+      <w:pPr>
+        <w:ind w:left="2520" w:hanging="360"/>
+      </w:pPr>
+      <w:rPr>
+        <w:rFonts w:ascii="Courier New" w:hAnsi="Courier New" w:cs="Courier New" w:hint="default"/>
+      </w:rPr>
+    </w:lvl>
+    <w:lvl w:ilvl="2" w:tplc="10090005" w:tentative="1">
+      <w:start w:val="1"/>
+      <w:numFmt w:val="bullet"/>
+      <w:lvlText w:val=""/>
+      <w:lvlJc w:val="left"/>
+      <w:pPr>
+        <w:ind w:left="3240" w:hanging="360"/>
+      </w:pPr>
+      <w:rPr>
+        <w:rFonts w:ascii="Wingdings" w:hAnsi="Wingdings" w:hint="default"/>
+      </w:rPr>
+    </w:lvl>
+    <w:lvl w:ilvl="3" w:tplc="10090001" w:tentative="1">
+      <w:start w:val="1"/>
+      <w:numFmt w:val="bullet"/>
+      <w:lvlText w:val=""/>
+      <w:lvlJc w:val="left"/>
+      <w:pPr>
+        <w:ind w:left="3960" w:hanging="360"/>
+      </w:pPr>
+      <w:rPr>
+        <w:rFonts w:ascii="Symbol" w:hAnsi="Symbol" w:hint="default"/>
+      </w:rPr>
+    </w:lvl>
+    <w:lvl w:ilvl="4" w:tplc="10090003" w:tentative="1">
+      <w:start w:val="1"/>
+      <w:numFmt w:val="bullet"/>
+      <w:lvlText w:val="o"/>
+      <w:lvlJc w:val="left"/>
+      <w:pPr>
+        <w:ind w:left="4680" w:hanging="360"/>
+      </w:pPr>
+      <w:rPr>
+        <w:rFonts w:ascii="Courier New" w:hAnsi="Courier New" w:cs="Courier New" w:hint="default"/>
+      </w:rPr>
+    </w:lvl>
+    <w:lvl w:ilvl="5" w:tplc="10090005" w:tentative="1">
+      <w:start w:val="1"/>
+      <w:numFmt w:val="bullet"/>
+      <w:lvlText w:val=""/>
+      <w:lvlJc w:val="left"/>
+      <w:pPr>
+        <w:ind w:left="5400" w:hanging="360"/>
+      </w:pPr>
+      <w:rPr>
+        <w:rFonts w:ascii="Wingdings" w:hAnsi="Wingdings" w:hint="default"/>
+      </w:rPr>
+    </w:lvl>
+    <w:lvl w:ilvl="6" w:tplc="10090001" w:tentative="1">
+      <w:start w:val="1"/>
+      <w:numFmt w:val="bullet"/>
+      <w:lvlText w:val=""/>
+      <w:lvlJc w:val="left"/>
+      <w:pPr>
+        <w:ind w:left="6120" w:hanging="360"/>
+      </w:pPr>
+      <w:rPr>
+        <w:rFonts w:ascii="Symbol" w:hAnsi="Symbol" w:hint="default"/>
+      </w:rPr>
+    </w:lvl>
+    <w:lvl w:ilvl="7" w:tplc="10090003" w:tentative="1">
+      <w:start w:val="1"/>
+      <w:numFmt w:val="bullet"/>
+      <w:lvlText w:val="o"/>
+      <w:lvlJc w:val="left"/>
+      <w:pPr>
+        <w:ind w:left="6840" w:hanging="360"/>
+      </w:pPr>
+      <w:rPr>
+        <w:rFonts w:ascii="Courier New" w:hAnsi="Courier New" w:cs="Courier New" w:hint="default"/>
+      </w:rPr>
+    </w:lvl>
+    <w:lvl w:ilvl="8" w:tplc="10090005" w:tentative="1">
+      <w:start w:val="1"/>
+      <w:numFmt w:val="bullet"/>
+      <w:lvlText w:val=""/>
+      <w:lvlJc w:val="left"/>
+      <w:pPr>
+        <w:ind w:left="7560" w:hanging="360"/>
+      </w:pPr>
+      <w:rPr>
+        <w:rFonts w:ascii="Wingdings" w:hAnsi="Wingdings" w:hint="default"/>
+      </w:rPr>
+    </w:lvl>
+  </w:abstractNum>
+  <w:abstractNum w:abstractNumId="2" w15:restartNumberingAfterBreak="0">
+    <w:nsid w:val="7BF122CC"/>
+    <w:multiLevelType w:val="hybridMultilevel"/>
+    <w:tmpl w:val="6226A7D4"/>
+    <w:lvl w:ilvl="0" w:tplc="9A786780">
+      <w:start w:val="1"/>
+      <w:numFmt w:val="bullet"/>
+      <w:lvlText w:val=""/>
+      <w:lvlJc w:val="left"/>
+      <w:pPr>
+        <w:ind w:left="720" w:hanging="360"/>
+      </w:pPr>
+      <w:rPr>
+        <w:rFonts w:ascii="Symbol" w:hAnsi="Symbol" w:hint="default"/>
+      </w:rPr>
+    </w:lvl>
+    <w:lvl w:ilvl="1" w:tplc="10090003">
+      <w:start w:val="1"/>
+      <w:numFmt w:val="bullet"/>
+      <w:lvlText w:val="o"/>
+      <w:lvlJc w:val="left"/>
+      <w:pPr>
+        <w:ind w:left="1440" w:hanging="360"/>
+      </w:pPr>
+      <w:rPr>
+        <w:rFonts w:ascii="Courier New" w:hAnsi="Courier New" w:cs="Courier New" w:hint="default"/>
+      </w:rPr>
+    </w:lvl>
+    <w:lvl w:ilvl="2" w:tplc="10090005" w:tentative="1">
+      <w:start w:val="1"/>
+      <w:numFmt w:val="bullet"/>
+      <w:lvlText w:val=""/>
+      <w:lvlJc w:val="left"/>
+      <w:pPr>
+        <w:ind w:left="2160" w:hanging="360"/>
+      </w:pPr>
+      <w:rPr>
+        <w:rFonts w:ascii="Wingdings" w:hAnsi="Wingdings" w:hint="default"/>
+      </w:rPr>
+    </w:lvl>
+    <w:lvl w:ilvl="3" w:tplc="10090001" w:tentative="1">
+      <w:start w:val="1"/>
+      <w:numFmt w:val="bullet"/>
+      <w:lvlText w:val=""/>
+      <w:lvlJc w:val="left"/>
+      <w:pPr>
+        <w:ind w:left="2880" w:hanging="360"/>
+      </w:pPr>
+      <w:rPr>
+        <w:rFonts w:ascii="Symbol" w:hAnsi="Symbol" w:hint="default"/>
+      </w:rPr>
+    </w:lvl>
+    <w:lvl w:ilvl="4" w:tplc="10090003" w:tentative="1">
+      <w:start w:val="1"/>
+      <w:numFmt w:val="bullet"/>
+      <w:lvlText w:val="o"/>
+      <w:lvlJc w:val="left"/>
+      <w:pPr>
+        <w:ind w:left="3600" w:hanging="360"/>
+      </w:pPr>
+      <w:rPr>
+        <w:rFonts w:ascii="Courier New" w:hAnsi="Courier New" w:cs="Courier New" w:hint="default"/>
+      </w:rPr>
+    </w:lvl>
+    <w:lvl w:ilvl="5" w:tplc="10090005" w:tentative="1">
+      <w:start w:val="1"/>
+      <w:numFmt w:val="bullet"/>
+      <w:lvlText w:val=""/>
+      <w:lvlJc w:val="left"/>
+      <w:pPr>
+        <w:ind w:left="4320" w:hanging="360"/>
+      </w:pPr>
+      <w:rPr>
+        <w:rFonts w:ascii="Wingdings" w:hAnsi="Wingdings" w:hint="default"/>
+      </w:rPr>
+    </w:lvl>
+    <w:lvl w:ilvl="6" w:tplc="10090001" w:tentative="1">
+      <w:start w:val="1"/>
+      <w:numFmt w:val="bullet"/>
+      <w:lvlText w:val=""/>
+      <w:lvlJc w:val="left"/>
+      <w:pPr>
+        <w:ind w:left="5040" w:hanging="360"/>
+      </w:pPr>
+      <w:rPr>
+        <w:rFonts w:ascii="Symbol" w:hAnsi="Symbol" w:hint="default"/>
+      </w:rPr>
+    </w:lvl>
+    <w:lvl w:ilvl="7" w:tplc="10090003" w:tentative="1">
+      <w:start w:val="1"/>
+      <w:numFmt w:val="bullet"/>
+      <w:lvlText w:val="o"/>
+      <w:lvlJc w:val="left"/>
+      <w:pPr>
+        <w:ind w:left="5760" w:hanging="360"/>
+      </w:pPr>
+      <w:rPr>
+        <w:rFonts w:ascii="Courier New" w:hAnsi="Courier New" w:cs="Courier New" w:hint="default"/>
+      </w:rPr>
+    </w:lvl>
+    <w:lvl w:ilvl="8" w:tplc="10090005" w:tentative="1">
+      <w:start w:val="1"/>
+      <w:numFmt w:val="bullet"/>
+      <w:lvlText w:val=""/>
+      <w:lvlJc w:val="left"/>
+      <w:pPr>
+        <w:ind w:left="6480" w:hanging="360"/>
+      </w:pPr>
+      <w:rPr>
+        <w:rFonts w:ascii="Wingdings" w:hAnsi="Wingdings" w:hint="default"/>
+      </w:rPr>
+    </w:lvl>
+  </w:abstractNum>
   <w:num w:numId="1">
     <w:abstractNumId w:val="0"/>
+  </w:num>
+  <w:num w:numId="2">
+    <w:abstractNumId w:val="2"/>
+  </w:num>
+  <w:num w:numId="3">
+    <w:abstractNumId w:val="1"/>
   </w:num>
 </w:numbering>
 </file>
 
 <file path=word/styles.xml><?xml version="1.0" encoding="utf-8"?>
-<w:styles xmlns:mc="http://schemas.openxmlformats.org/markup-compatibility/2006" xmlns:r="http://schemas.openxmlformats.org/officeDocument/2006/relationships" xmlns:w="http://schemas.openxmlformats.org/wordprocessingml/2006/main" xmlns:w14="http://schemas.microsoft.com/office/word/2010/wordml" xmlns:w15="http://schemas.microsoft.com/office/word/2012/wordml" xmlns:w16cid="http://schemas.microsoft.com/office/word/2016/wordml/cid" xmlns:w16se="http://schemas.microsoft.com/office/word/2015/wordml/symex" mc:Ignorable="w14 w15 w16se w16cid">
+<w:styles xmlns:mc="http://schemas.openxmlformats.org/markup-compatibility/2006" xmlns:r="http://schemas.openxmlformats.org/officeDocument/2006/relationships" xmlns:w="http://schemas.openxmlformats.org/wordprocessingml/2006/main" xmlns:w14="http://schemas.microsoft.com/office/word/2010/wordml" xmlns:w15="http://schemas.microsoft.com/office/word/2012/wordml" xmlns:w16cex="http://schemas.microsoft.com/office/word/2018/wordml/cex" xmlns:w16cid="http://schemas.microsoft.com/office/word/2016/wordml/cid" xmlns:w16="http://schemas.microsoft.com/office/word/2018/wordml" xmlns:w16sdtdh="http://schemas.microsoft.com/office/word/2020/wordml/sdtdatahash" xmlns:w16se="http://schemas.microsoft.com/office/word/2015/wordml/symex" mc:Ignorable="w14 w15 w16se w16cid w16 w16cex w16sdtdh">
   <w:docDefaults>
     <w:rPrDefault>
       <w:rPr>
@@ -789,7 +1006,7 @@
       </w:pPr>
     </w:pPrDefault>
   </w:docDefaults>
-  <w:latentStyles w:defLockedState="0" w:defUIPriority="99" w:defSemiHidden="0" w:defUnhideWhenUsed="0" w:defQFormat="0" w:count="375">
+  <w:latentStyles w:defLockedState="0" w:defUIPriority="99" w:defSemiHidden="0" w:defUnhideWhenUsed="0" w:defQFormat="0" w:count="376">
     <w:lsdException w:name="Normal" w:uiPriority="0" w:qFormat="1"/>
     <w:lsdException w:name="heading 1" w:uiPriority="9" w:qFormat="1"/>
     <w:lsdException w:name="heading 2" w:semiHidden="1" w:uiPriority="9" w:unhideWhenUsed="1" w:qFormat="1"/>
@@ -895,6 +1112,7 @@
     <w:lsdException w:name="HTML Sample" w:semiHidden="1" w:unhideWhenUsed="1"/>
     <w:lsdException w:name="HTML Typewriter" w:semiHidden="1" w:unhideWhenUsed="1"/>
     <w:lsdException w:name="HTML Variable" w:semiHidden="1" w:unhideWhenUsed="1"/>
+    <w:lsdException w:name="Normal Table" w:semiHidden="1" w:unhideWhenUsed="1"/>
     <w:lsdException w:name="annotation subject" w:semiHidden="1" w:unhideWhenUsed="1"/>
     <w:lsdException w:name="No List" w:semiHidden="1" w:unhideWhenUsed="1"/>
     <w:lsdException w:name="Outline List 1" w:semiHidden="1" w:unhideWhenUsed="1"/>
@@ -938,8 +1156,10 @@
     <w:lsdException w:name="Table Elegant" w:semiHidden="1" w:unhideWhenUsed="1"/>
     <w:lsdException w:name="Table Professional" w:semiHidden="1" w:unhideWhenUsed="1"/>
     <w:lsdException w:name="Table Subtle 1" w:semiHidden="1" w:unhideWhenUsed="1"/>
+    <w:lsdException w:name="Table Subtle 2" w:semiHidden="1" w:unhideWhenUsed="1"/>
     <w:lsdException w:name="Table Web 1" w:semiHidden="1" w:unhideWhenUsed="1"/>
     <w:lsdException w:name="Table Web 2" w:semiHidden="1" w:unhideWhenUsed="1"/>
+    <w:lsdException w:name="Table Web 3" w:semiHidden="1" w:unhideWhenUsed="1"/>
     <w:lsdException w:name="Balloon Text" w:semiHidden="1" w:unhideWhenUsed="1"/>
     <w:lsdException w:name="Table Grid" w:uiPriority="39"/>
     <w:lsdException w:name="Table Theme" w:semiHidden="1" w:unhideWhenUsed="1"/>
@@ -1162,6 +1382,7 @@
     <w:lsdException w:name="Smart Hyperlink" w:semiHidden="1" w:unhideWhenUsed="1"/>
     <w:lsdException w:name="Hashtag" w:semiHidden="1" w:unhideWhenUsed="1"/>
     <w:lsdException w:name="Unresolved Mention" w:semiHidden="1" w:unhideWhenUsed="1"/>
+    <w:lsdException w:name="Smart Link" w:semiHidden="1" w:unhideWhenUsed="1"/>
   </w:latentStyles>
   <w:style w:type="paragraph" w:default="1" w:styleId="Normal">
     <w:name w:val="Normal"/>

</xml_diff>